<commit_message>
docs: update v3.1 before_remove_ha_mcp document via python-docx
</commit_message>
<xml_diff>
--- a/smarthome_nlu_v3.1.before_remove_ha_mcp.docx
+++ b/smarthome_nlu_v3.1.before_remove_ha_mcp.docx
@@ -6503,7 +6503,7 @@
                 <w:sz w:val="18"/>
                 <w:szCs w:val="18"/>
               </w:rPr>
-              <w:t xml:space="preserve">entities = await ha_mcp.call('ha_get_all_entities')</w:t>
+              <w:t>entities = await .call('ha_get_all_entities')</w:t>
             </w:r>
           </w:p>
           <w:p>
@@ -11347,7 +11347,7 @@
                 <w:sz w:val="20"/>
                 <w:szCs w:val="20"/>
               </w:rPr>
-              <w:t xml:space="preserve">src/ha_mcp/server.py</w:t>
+              <w:t>src//server.py</w:t>
             </w:r>
           </w:p>
         </w:tc>
@@ -11439,7 +11439,7 @@
                 <w:sz w:val="20"/>
                 <w:szCs w:val="20"/>
               </w:rPr>
-              <w:t xml:space="preserve">src/ha_mcp/client/rest_client.py</w:t>
+              <w:t>src//client/rest_client.py</w:t>
             </w:r>
           </w:p>
         </w:tc>
@@ -11531,7 +11531,7 @@
                 <w:sz w:val="20"/>
                 <w:szCs w:val="20"/>
               </w:rPr>
-              <w:t xml:space="preserve">src/ha_mcp/client/websocket_client.py</w:t>
+              <w:t>src//client/websocket_client.py</w:t>
             </w:r>
           </w:p>
         </w:tc>
@@ -11623,7 +11623,7 @@
                 <w:sz w:val="20"/>
                 <w:szCs w:val="20"/>
               </w:rPr>
-              <w:t xml:space="preserve">src/ha_mcp/tools/registry.py</w:t>
+              <w:t>src//tools/registry.py</w:t>
             </w:r>
           </w:p>
         </w:tc>
@@ -11715,7 +11715,7 @@
                 <w:sz w:val="20"/>
                 <w:szCs w:val="20"/>
               </w:rPr>
-              <w:t xml:space="preserve">src/ha_mcp/config.py</w:t>
+              <w:t>src//config.py</w:t>
             </w:r>
           </w:p>
         </w:tc>
@@ -14221,7 +14221,7 @@
                 <w:sz w:val="18"/>
                 <w:szCs w:val="18"/>
               </w:rPr>
-              <w:t xml:space="preserve">result = await ha_mcp.call('ha_search_entities', {</w:t>
+              <w:t>result = await .call('ha_search_entities', {</w:t>
             </w:r>
           </w:p>
           <w:p>
@@ -16809,7 +16809,7 @@
                 <w:sz w:val="18"/>
                 <w:szCs w:val="18"/>
               </w:rPr>
-              <w:t xml:space="preserve">        entities = await ha_mcp.call('ha_search_entities',</w:t>
+              <w:t xml:space="preserve">        entities = await .call('ha_search_entities',</w:t>
             </w:r>
           </w:p>
           <w:p>
@@ -16935,7 +16935,7 @@
                 <w:sz w:val="18"/>
                 <w:szCs w:val="18"/>
               </w:rPr>
-              <w:t xml:space="preserve">    result = await ha_mcp.call('ha_call_service', {</w:t>
+              <w:t xml:space="preserve">    result = await .call('ha_call_service', {</w:t>
             </w:r>
           </w:p>
           <w:p>
@@ -25983,7 +25983,7 @@
                 <w:sz w:val="18"/>
                 <w:szCs w:val="18"/>
               </w:rPr>
-              <w:t xml:space="preserve">async def execute_with_idempotency(user_id, intent, ha_mcp_client,</w:t>
+              <w:t>async def execute_with_idempotency(user_id, intent, _client,</w:t>
             </w:r>
           </w:p>
           <w:p>
@@ -26081,7 +26081,7 @@
                 <w:sz w:val="18"/>
                 <w:szCs w:val="18"/>
               </w:rPr>
-              <w:t xml:space="preserve">    result = await ha_mcp_client.call_service(intent)</w:t>
+              <w:t xml:space="preserve">    result = await _client.call_service(intent)</w:t>
             </w:r>
           </w:p>
           <w:p>
@@ -28598,7 +28598,7 @@
                 <w:sz w:val="18"/>
                 <w:szCs w:val="18"/>
               </w:rPr>
-              <w:t xml:space="preserve">    return await ha_mcp.call(tool_name, params)</w:t>
+              <w:t xml:space="preserve">    return await .call(tool_name, params)</w:t>
             </w:r>
           </w:p>
         </w:tc>

</xml_diff>